<commit_message>
Spital-Bewerbungen auf Basis des EDA-Schreibens neu aufbauen
Co-Authored-By: Claude Opus 5.5 <noreply@anthropic.com>
Claude-Session: https://claude.ai/code/session_01Hc7onFwdUiEGTMraWXu8vk
</commit_message>
<xml_diff>
--- a/Lorik_Duhanaj_Bewerbung_Luzerner_Kantonsspital.docx
+++ b/Lorik_Duhanaj_Bewerbung_Luzerner_Kantonsspital.docx
@@ -143,7 +143,7 @@
         <w:rPr>
           <w:b w:val="0"/>
         </w:rPr>
-        <w:t>Mit grossem Interesse bewerbe ich mich für das Praktikum WMS/HMS am Luzerner Kantonsspital ab August 2027. Zurzeit besuche ich das 3. Jahr der Wirtschaftsmittelschule und freue mich darauf, mein Wissen in der Praxis anzuwenden. Das Gesundheitswesen interessiert mich, weil es sich ständig weiterentwickelt und wirklich etwas bewegt. Besonders spricht mich an, wie abwechslungsreich Ihre Praktika sind: Sowohl die ambulante Abrechnung und der Einkauf als auch die HR-Abteilung interessieren mich sehr.</w:t>
+        <w:t>Mit grossem Interesse bewerbe ich mich für das Praktikum WMS/HMS (3+1) am Luzerner Kantonsspital ab August 2027. Besonders ansprechend finde ich die Möglichkeit, meine administrativen Fähigkeiten, meine Freude am Organisieren und mein Interesse am Gesundheitswesen in einem Spital einzubringen. Die Aufgaben bei der Rechnungskontrolle und Fakturierung, bei der Bearbeitung der eingehenden Post sowie bei Auskünften am Telefon und am Schalter entsprechen meinen Interessen. Sowohl das Praktikum in der ambulanten Abrechnung und im Einkauf als auch jenes in der HR-Abteilung sprechen mich an. Besonders motiviert mich die Aussicht, in einem professionellen Umfeld zu arbeiten und erfahrene Fachpersonen bei ihren vielseitigen Aufgaben zu unterstützen.</w:t>
       </w:r>
     </w:p>
     <w:p>
@@ -154,7 +154,7 @@
         <w:rPr>
           <w:b w:val="0"/>
         </w:rPr>
-        <w:t>Schon früh habe ich grosse Freude an Tätigkeiten am Computer entwickelt und inzwischen mehrere ICDL-Advanced-Zertifikate erworben. Zusammen mit meinem Interesse an Mathematik und Wirtschaft war die Wirtschaftsmittelschule für mich die richtige Wahl. Besonders die Fächer Mathematik, Wirtschaft und Recht sowie Finanz- und Rechnungswesen bereiten mir Freude und stärken mein Verständnis für wirtschaftliche Zusammenhänge. Meine Zahlenaffinität möchte ich gerne bei der Rechnungskontrolle, der Fakturierung oder der Budgetkontrolle einsetzen. Im Fach Deutsch konnte ich mich im Zeugnis von einer 4 auf eine 5 hocharbeiten, und mein dreiwöchiger Sprachaufenthalt in Brighton hat mein Englisch gestärkt.</w:t>
+        <w:t>Schon früh entwickelte ich eine grosse Freude an Tätigkeiten am Computer und habe inzwischen mehrere ICDL-Advanced-Zertifikate erworben. Zusammen mit meinem Interesse an Mathematik und Wirtschaft stellte sich für mich die Frage, welche Ausbildung am besten zu meinen Interessen und Stärken passt. Die Wirtschaftsmittelschule erwies sich für mich als passende Wahl. Besonders die Fächer Mathematik, Wirtschaft und Recht sowie Finanz- und Rechnungswesen bereiten mir Freude und stärken mein Verständnis für wirtschaftliche Zusammenhänge. Im Fach Deutsch konnte ich mich im Zeugnis von einer 4 auf eine 5 hocharbeiten. Gleichzeitig zeichnen mich Zuverlässigkeit, eine hohe Zahlenaffinität und eine motivierte Lernbereitschaft aus. Erste praktische Erfahrung sammle ich im Betrieb meines Vaters, wo ich aushelfe und die Post verwalte. Auch der Kontakt mit Menschen verschiedener Generationen bereitet mir Freude.</w:t>
       </w:r>
     </w:p>
     <w:p>
@@ -165,18 +165,7 @@
         <w:rPr>
           <w:b w:val="0"/>
         </w:rPr>
-        <w:t>Erste praktische Erfahrung konnte ich bereits sammeln: Im Betrieb meines Vaters helfe ich aus und verwalte dort die Post. Ich bin zuverlässig, arbeite genau und organisiere gerne. Zudem bereitet mir der Kontakt mit Menschen verschiedener Generationen Freude. Deshalb freue ich mich auch darauf, Patientinnen und Patienten sowie Mitarbeitenden am Telefon und am Schalter Auskunft zu geben.</w:t>
-      </w:r>
-    </w:p>
-    <w:p>
-      <w:pPr>
-        <w:spacing w:after="200"/>
-      </w:pPr>
-      <w:r>
-        <w:rPr>
-          <w:b w:val="0"/>
-        </w:rPr>
-        <w:t>Als langjähriger Schlüsselspieler in meinem Fussballclub habe ich gelernt, Verantwortung zu übernehmen, im Team zu arbeiten und mich für gemeinsame Ziele einzusetzen. Beim Schach entwickle ich meine analytische Denkweise weiter und trainiere meine strategischen Fähigkeiten. Ich sehe mich als selbstständige, lösungsorientierte und wissbegierige Persönlichkeit mit hoher Lern- und Leistungsbereitschaft. Genau diese Einstellung möchte ich in Ihr Team einbringen.</w:t>
+        <w:t>Als langjähriger Schlüsselspieler in meinem Fussballclub habe ich gelernt, Verantwortung zu übernehmen, im Team zu arbeiten und mich für gemeinsame Ziele einzusetzen. Beim Schach kann ich meine analytische Denkweise weiterentwickeln und meine strategischen Fähigkeiten trainieren. Zusammen mit meiner Neugier, meiner Erfahrung aus einem dreiwöchigen Sprachaufenthalt in Brighton sowie meiner hohen Leistungs- und Lernbereitschaft sehe ich mich als selbstständige, lösungsorientierte und wissbegierige Persönlichkeit.</w:t>
       </w:r>
     </w:p>
     <w:p>

</xml_diff>